<commit_message>
Add GitHub link to resume layout docx.
Refresh package-lock.json peer metadata after npm.

Made-with: Cursor
</commit_message>
<xml_diff>
--- a/data/Gnyani_resume_layout.docx
+++ b/data/Gnyani_resume_layout.docx
@@ -50,13 +50,7 @@
         <w:rPr>
           <w:spacing w:val="-5"/>
         </w:rPr>
-        <w:t xml:space="preserve"> </w:t>
-      </w:r>
-      <w:r>
-        <w:rPr>
-          <w:spacing w:val="-5"/>
-        </w:rPr>
-        <w:t xml:space="preserve">| </w:t>
+        <w:t xml:space="preserve"> | </w:t>
       </w:r>
       <w:hyperlink r:id="rId5">
         <w:r>
@@ -89,6 +83,45 @@
             <w:u w:val="single" w:color="467885"/>
           </w:rPr>
           <w:t>LinkedIn</w:t>
+        </w:r>
+        <w:r>
+          <w:rPr>
+            <w:color w:val="467885"/>
+            <w:spacing w:val="-3"/>
+          </w:rPr>
+          <w:t xml:space="preserve"> </w:t>
+        </w:r>
+      </w:hyperlink>
+      <w:r>
+        <w:t>|</w:t>
+      </w:r>
+      <w:r>
+        <w:rPr>
+          <w:spacing w:val="55"/>
+        </w:rPr>
+        <w:t xml:space="preserve"> </w:t>
+      </w:r>
+      <w:hyperlink r:id="rId7">
+        <w:r>
+          <w:rPr>
+            <w:color w:val="467885"/>
+            <w:u w:val="single" w:color="467885"/>
+          </w:rPr>
+          <w:t>G</w:t>
+        </w:r>
+        <w:r>
+          <w:rPr>
+            <w:color w:val="467885"/>
+            <w:u w:val="single" w:color="467885"/>
+          </w:rPr>
+          <w:t>i</w:t>
+        </w:r>
+        <w:r>
+          <w:rPr>
+            <w:color w:val="467885"/>
+            <w:u w:val="single" w:color="467885"/>
+          </w:rPr>
+          <w:t>thub</w:t>
         </w:r>
         <w:r>
           <w:rPr>
@@ -180,7 +213,7 @@
               </wp:anchor>
             </w:drawing>
           </mc:Choice>
-          <mc:Fallback xmlns:pic="http://schemas.openxmlformats.org/drawingml/2006/picture" xmlns:a="http://schemas.openxmlformats.org/drawingml/2006/main" xmlns:ve="http://schemas.openxmlformats.org/markup-compatibility/2006">
+          <mc:Fallback xmlns:ve="http://schemas.openxmlformats.org/markup-compatibility/2006" xmlns:a="http://schemas.openxmlformats.org/drawingml/2006/main" xmlns:pic="http://schemas.openxmlformats.org/drawingml/2006/picture">
             <w:pict>
               <v:rect style="position:absolute;margin-left:34.525002pt;margin-top:18.308907pt;width:543.22pt;height:.5pt;mso-position-horizontal-relative:page;mso-position-vertical-relative:paragraph;z-index:-15728640;mso-wrap-distance-left:0;mso-wrap-distance-right:0" id="docshape1" filled="true" fillcolor="#000000" stroked="false">
                 <v:fill type="solid"/>
@@ -553,7 +586,7 @@
               </wp:anchor>
             </w:drawing>
           </mc:Choice>
-          <mc:Fallback xmlns:pic="http://schemas.openxmlformats.org/drawingml/2006/picture" xmlns:a="http://schemas.openxmlformats.org/drawingml/2006/main" xmlns:ve="http://schemas.openxmlformats.org/markup-compatibility/2006">
+          <mc:Fallback xmlns:ve="http://schemas.openxmlformats.org/markup-compatibility/2006" xmlns:a="http://schemas.openxmlformats.org/drawingml/2006/main" xmlns:pic="http://schemas.openxmlformats.org/drawingml/2006/picture">
             <w:pict>
               <v:rect style="position:absolute;margin-left:34.525002pt;margin-top:17.284843pt;width:543.22pt;height:.5pt;mso-position-horizontal-relative:page;mso-position-vertical-relative:paragraph;z-index:-15728128;mso-wrap-distance-left:0;mso-wrap-distance-right:0" id="docshape2" filled="true" fillcolor="#000000" stroked="false">
                 <v:fill type="solid"/>
@@ -1976,14 +2009,7 @@
           <w:b/>
           <w:sz w:val="20"/>
         </w:rPr>
-        <w:t>Engineer</w:t>
-      </w:r>
-      <w:r>
-        <w:rPr>
-          <w:b/>
-          <w:sz w:val="20"/>
-        </w:rPr>
-        <w:t xml:space="preserve">                                                                                                                                                                </w:t>
+        <w:t xml:space="preserve">Engineer                                                                                                                                                                </w:t>
       </w:r>
       <w:r>
         <w:rPr>
@@ -2042,15 +2068,7 @@
           <w:w w:val="110"/>
           <w:sz w:val="20"/>
         </w:rPr>
-        <w:t>Jul</w:t>
-      </w:r>
-      <w:r>
-        <w:rPr>
-          <w:b/>
-          <w:w w:val="110"/>
-          <w:sz w:val="20"/>
-        </w:rPr>
-        <w:t>y</w:t>
+        <w:t>July</w:t>
       </w:r>
       <w:r>
         <w:rPr>
@@ -2723,7 +2741,7 @@
               </wp:anchor>
             </w:drawing>
           </mc:Choice>
-          <mc:Fallback xmlns:pic="http://schemas.openxmlformats.org/drawingml/2006/picture" xmlns:a="http://schemas.openxmlformats.org/drawingml/2006/main" xmlns:ve="http://schemas.openxmlformats.org/markup-compatibility/2006">
+          <mc:Fallback xmlns:ve="http://schemas.openxmlformats.org/markup-compatibility/2006" xmlns:a="http://schemas.openxmlformats.org/drawingml/2006/main" xmlns:pic="http://schemas.openxmlformats.org/drawingml/2006/picture">
             <w:pict>
               <v:rect style="position:absolute;margin-left:34.525002pt;margin-top:17.160742pt;width:543.22pt;height:.5pt;mso-position-horizontal-relative:page;mso-position-vertical-relative:paragraph;z-index:-15727616;mso-wrap-distance-left:0;mso-wrap-distance-right:0" id="docshape3" filled="true" fillcolor="#000000" stroked="false">
                 <v:fill type="solid"/>
@@ -3090,7 +3108,7 @@
               </wp:anchor>
             </w:drawing>
           </mc:Choice>
-          <mc:Fallback xmlns:pic="http://schemas.openxmlformats.org/drawingml/2006/picture" xmlns:a="http://schemas.openxmlformats.org/drawingml/2006/main" xmlns:ve="http://schemas.openxmlformats.org/markup-compatibility/2006">
+          <mc:Fallback xmlns:ve="http://schemas.openxmlformats.org/markup-compatibility/2006" xmlns:a="http://schemas.openxmlformats.org/drawingml/2006/main" xmlns:pic="http://schemas.openxmlformats.org/drawingml/2006/picture">
             <w:pict>
               <v:rect style="position:absolute;margin-left:34.525002pt;margin-top:29.592968pt;width:543.22pt;height:.5pt;mso-position-horizontal-relative:page;mso-position-vertical-relative:paragraph;z-index:15730176" id="docshape4" filled="true" fillcolor="#000000" stroked="false">
                 <v:fill type="solid"/>
@@ -3773,15 +3791,7 @@
           <w:spacing w:val="-2"/>
           <w:sz w:val="20"/>
         </w:rPr>
-        <w:t>P</w:t>
-      </w:r>
-      <w:r>
-        <w:rPr>
-          <w:b/>
-          <w:spacing w:val="-2"/>
-          <w:sz w:val="20"/>
-        </w:rPr>
-        <w:t>ROJECT</w:t>
+        <w:t>PROJECT</w:t>
       </w:r>
     </w:p>
     <w:p>

</xml_diff>